<commit_message>
Epithets: the Arthashastri (Ch13) and the Dhammapala (Ch15/16); Ch14 frame conversion to Flitzberg POV; tracker: decision log + two-hidden-hands rule
</commit_message>
<xml_diff>
--- a/manuscript/chapter-13-the-board.docx
+++ b/manuscript/chapter-13-the-board.docx
@@ -196,7 +196,7 @@
     </w:p>
     <w:p>
       <w:r>
-        <w:t>The Chanakya Grandmaster entered at an unhurried pace, and the room seemed to make space for him before he reached the board. Ravi stood at once. When the Grandmaster stopped across from him, Ravi bowed with one hand over his heart. The Grandmaster answered with a slight inclination of his head, equal parts acknowledgment and assessment.</w:t>
+        <w:t>The Chanakya Grandmaster entered at an unhurried pace, and the room seemed to make space for him before he reached the board. Within the house he was the Arthashastri — master of the old science of wealth and statecraft that had given the gana its name — and the elders used the title the way other houses used a bow. Ravi stood at once. When the Grandmaster stopped across from him, Ravi bowed with one hand over his heart. The Grandmaster answered with a slight inclination of his head, equal parts acknowledgment and assessment.</w:t>
       </w:r>
     </w:p>
     <w:p>
@@ -671,7 +671,7 @@
     </w:p>
     <w:p>
       <w:r>
-        <w:t>The Chanakya Grandmaster looked at him once, and for the first time there was no lesson in the gaze, only calculation moving too quickly to share.</w:t>
+        <w:t>The Arthashastri looked at him once, and for the first time there was no lesson in the gaze, only calculation moving too quickly to share.</w:t>
       </w:r>
     </w:p>
     <w:p>

</xml_diff>

<commit_message>
Ch13: convert two template negations (elders' gathering, living-board staging)
</commit_message>
<xml_diff>
--- a/manuscript/chapter-13-the-board.docx
+++ b/manuscript/chapter-13-the-board.docx
@@ -181,7 +181,7 @@
     </w:p>
     <w:p>
       <w:r>
-        <w:t>They did not gather with the solemnity of Drona's council or the armored silence of Ashoka's instructors. They watched as people who loved a contest but knew better than to call it entertainment. Every elder carried a tablet, stylus, or folded sheet marked with probabilities. Some whispered opening lines before the game began. Others watched Ravi rather than the board, studying whether the young representative's breath changed under the weight of being seen.</w:t>
+        <w:t>They gathered without the solemnity of Drona's council or the armored silence of Ashoka's instructors, watching as people who loved a contest but knew better than to call it entertainment. Every elder carried a tablet, stylus, or folded sheet marked with probabilities. Some whispered opening lines before the game began. Others watched Ravi rather than the board, studying whether the young representative's breath changed under the weight of being seen.</w:t>
       </w:r>
     </w:p>
     <w:p>
@@ -246,7 +246,7 @@
     </w:p>
     <w:p>
       <w:r>
-        <w:t>Chanakya did not stage the living board to make chess beautiful. It staged it to make consequence visible. A small move at the table became a body crossing open ground. A careless exchange became a footman stepping into capture. A patient strategy became an animal waiting in disciplined heat while every spectator imagined the cost of moving it too soon.</w:t>
+        <w:t>Chanakya staged the living board not to make chess beautiful but to make consequence visible. A small move at the table became a body crossing open ground. A careless exchange became a footman stepping into capture. A patient strategy became an animal waiting in disciplined heat while every spectator imagined the cost of moving it too soon.</w:t>
       </w:r>
     </w:p>
     <w:p>

</xml_diff>

<commit_message>
Ch13 finish (arena restaging, jargon translation, rook-elephant bridge, queens robed, koan compressed, real sky, Meru texture); Ch14 start (boundary direction, decades-long arrangement + seepage simile, cool-off years + rebuild rationale); tracker mid-Ch14
</commit_message>
<xml_diff>
--- a/manuscript/chapter-13-the-board.docx
+++ b/manuscript/chapter-13-the-board.docx
@@ -8,6 +8,7 @@
       </w:pPr>
       <w:r>
         <w:rPr>
+          <w:b/>
           <w:color w:val="000000"/>
         </w:rPr>
         <w:t>Chapter 13: The Board</w:t>
@@ -20,14 +21,7 @@
           <w:i/>
           <w:color w:val="5C6B7D"/>
         </w:rPr>
-        <w:t>Otto listened without interrupting. When she finished, he sat still for a long time. Then he said: “Master Chan did something close to this once. His hand locked up after he overworked it — weeks of cramping, fingers that wouldn’t open even when he willed them. He didn’t try to force it. He sat cross-legged every morning and opened the hand in his mind — slowly, fully, every finger uncurling, an hour at a time. After a month the hand started answering him again. I never understood why it worked. But what yo</w:t>
-      </w:r>
-      <w:r>
-        <w:rPr>
-          <w:i/>
-          <w:color w:val="5C6B7D"/>
-        </w:rPr>
-        <w:t>u just described — the brain needing feedback to break the loop — that’s the same principle. You give the brain a mirror; Chan gave it attention.”</w:t>
+        <w:t>Otto listened without interrupting. When she finished, he sat still for a long time. Then he said: “Master Chan did something close to this once. His hand locked up after he overworked it — weeks of cramping, fingers that wouldn’t open even when he willed them. He didn’t try to force it. He sat cross-legged every morning and opened the hand in his mind — slowly, fully, every finger uncurling, an hour at a time. After a month the hand started answering him again. I never understood why it worked. But what you just described — the brain needing feedback to break the loop — that’s the same principle. You give the brain a mirror; Chan gave it attention.”</w:t>
       </w:r>
     </w:p>
     <w:p>
@@ -46,13 +40,7 @@
     </w:p>
     <w:p>
       <w:r>
-        <w:t>Chanakya quarters were not bare like Ashoka barracks or severe like Kubera's administrative cells. They were arranged for calculation. A narrow bed folded into the wall when not in use. A writing surface extended from the opposite side, covered in thin panes that could be layered, rearranged, and wiped clean without leaving a trace. The walls were lined with recessed shelves, and what sat on them was not the resident's choice. Chanakya issued records to its representatives the way other houses issued equipm</w:t>
-      </w:r>
-      <w:r>
-        <w:t>ent: a working set curated to each person's current assignments, logged to the room, and rotated by the archive office whenever duties changed. Ravi's shelves held the library of an incident interpreter — policy briefs on monitoring doctrine, debate records on intervention thresholds, old diplomatic failures between the ganas, and annotated council decisions from disputes settled before he was born. The archive office kept such decisions in circulation because the disputes were never truly over: the same ar</w:t>
-      </w:r>
-      <w:r>
-        <w:t>guments returned in every generation wearing new names, and Chanakya expected its representatives to recognize an old argument before mistaking it for a new one.</w:t>
+        <w:t>Chanakya quarters were not bare like Ashoka barracks or severe like Kubera's administrative cells. They were arranged for calculation. A narrow bed folded into the wall when not in use. A writing surface extended from the opposite side, covered in thin panes that could be layered, rearranged, and wiped clean without leaving a trace. The walls were lined with recessed shelves, and what sat on them was not the resident's choice. Chanakya issued records to its representatives the way other houses issued equipment: a working set curated to each person's current assignments, logged to the room, and rotated by the archive office whenever duties changed. Ravi's shelves held the library of an incident interpreter — policy briefs on monitoring doctrine, debate records on intervention thresholds, old diplomatic failures between the ganas, and annotated council decisions from disputes settled before he was born. The archive office kept such decisions in circulation because the disputes were never truly over: the same arguments returned in every generation wearing new names, and Chanakya expected its representatives to recognize an old argument before mistaking it for a new one.</w:t>
       </w:r>
     </w:p>
     <w:p>
@@ -72,7 +60,6 @@
     </w:p>
     <w:p>
       <w:r>
-        <w:lastRenderedPageBreak/>
         <w:t>When the wall display opened, it did not greet him. Chanakya considered greetings wasteful before analysis.</w:t>
       </w:r>
     </w:p>
@@ -103,10 +90,7 @@
     </w:p>
     <w:p>
       <w:r>
-        <w:t>Every year, Chanakya ranked its top ten players across policy simulation, adversarial debate, probability games, and classical chess. The ranking did not honor talent alone. Talent was common in Chanakya; discipline was useful; victory was only evidence if the method survived scrutiny. The top ten entered a round-robin lottery for the privilege of playing one formal chess match against the Grandmaster. Most lost quickly. A few lasted long enough to earn a comment. Once in a generation, someone forced the Gr</w:t>
-      </w:r>
-      <w:r>
-        <w:t>andmaster to think before moving.</w:t>
+        <w:t>Every year, Chanakya ranked its top ten players across policy simulation, adversarial debate, probability games, and classical chess. The ranking did not honor talent alone. Talent was common in Chanakya; discipline was useful; victory was only evidence if the method survived scrutiny. The top ten entered a round-robin lottery for the privilege of playing one formal chess match against the Grandmaster. Most lost quickly. A few lasted long enough to earn a comment. Once in a generation, someone forced the Grandmaster to think before moving.</w:t>
       </w:r>
     </w:p>
     <w:p>
@@ -131,10 +115,7 @@
     </w:p>
     <w:p>
       <w:r>
-        <w:t>The corridor outside his quarters was already awake. Other Chanakya representatives moved toward the gymnasium with the same measured quiet, dressed in variations of green, gray, and ink-black. None wore the heavy authority of Ashoka, the clean restraint of Drona, or the muted wealth of Kubera. Chanakya dressed for conversation and consequence. The fabric allowed movement but never looseness. The collars framed the throat. The sleeves left the hands visible. A Chanakya representative's hands were expected t</w:t>
-      </w:r>
-      <w:r>
-        <w:t>o remain calm even when the words did not.</w:t>
+        <w:t>The corridor outside his quarters was already awake. Other Chanakya representatives moved toward the gymnasium with the same measured quiet, dressed in variations of green, gray, and ink-black. None wore the heavy authority of Ashoka, the clean restraint of Drona, or the muted wealth of Kubera. Chanakya dressed for conversation and consequence. The fabric allowed movement but never looseness. The collars framed the throat. The sleeves left the hands visible. A Chanakya representative's hands were expected to remain calm even when the words did not.</w:t>
       </w:r>
     </w:p>
     <w:p>
@@ -149,7 +130,6 @@
     </w:p>
     <w:p>
       <w:r>
-        <w:lastRenderedPageBreak/>
         <w:t>Twenty rounds were mandatory. They were not meant to build speed or muscle. Chanakya cared little for strength unless a person understood how to use it. The run tested how the mind responded to repetition, boredom, fatigue, and the temptation to stop paying attention. Anyone could think clearly during the first round. By the twentieth, exhaustion made concentration difficult. That was when the real test began: could a person continue thinking carefully when every part of the body wanted to quit?</w:t>
       </w:r>
     </w:p>
@@ -173,7 +153,6 @@
         <w:t>By the eighteenth, he had stopped noticing his lungs. The board held.</w:t>
       </w:r>
     </w:p>
-    <w:p/>
     <w:p>
       <w:r>
         <w:t>By the twentieth, the room had narrowed to the line of the track, the rhythm of his footfalls, and a single position suspended in his mind — and the knowledge waiting at the center tables.</w:t>
@@ -191,12 +170,17 @@
     </w:p>
     <w:p>
       <w:r>
-        <w:t>Ravi took water, dried his face, and turned toward the central floor.</w:t>
-      </w:r>
-    </w:p>
-    <w:p>
-      <w:r>
-        <w:t>While the runners had circled the outer ring, the gymnasium's heart had been remade. The strategy tables had been drawn back to form a wide square of open floor, and rows of seats now faced its center from all four sides. The hall's working lights had been brought low; a single bright cone fell on the middle of the square, so that everything outside it — the seats, the retired tables, the track — receded into a listening dimness. At the center of the light stood one table and two chairs.</w:t>
+        <w:t>Ravi took water, dried his face, and followed the escort waiting at the gymnasium doors.</w:t>
+      </w:r>
+    </w:p>
+    <w:p>
+      <w:r>
+        <w:t>The match was not played in the gymnasium. Once a year, Chanakya opened its arena — a sunken bowl at the heart of the platform, ringed by tiers of seats that climbed into shadow. By the time Ravi entered through the players' tunnel, the tiers were full: representatives and archivists, clerks and translators, teachers with rows of students, thousands of Chanakya's people settling into a hush that was not silence but attention. They had not come to watch two men at a table; from the upper tiers, a table would be a speck. They had come for the arena floor, where the game would be made large enough to see.</w:t>
+      </w:r>
+    </w:p>
+    <w:p>
+      <w:r>
+        <w:t>At the edge of the floor, raised half a level above it, stood the players' enclosure: a stone platform open toward the arena, with a ring of seats behind it for the few permitted to watch the players instead of the game. At the center of the enclosure stood one table and two chairs.</w:t>
       </w:r>
     </w:p>
     <w:p>
@@ -206,16 +190,12 @@
     </w:p>
     <w:p>
       <w:r>
-        <w:t xml:space="preserve">It was older than the tables around it, carved from dark stone and pale ceramic, its edges worn smooth by generations of hands that had reached for victory and found instruction </w:t>
-      </w:r>
-      <w:r>
-        <w:lastRenderedPageBreak/>
-        <w:t>instead. The pieces were arranged already. Black and white armies faced one another in perfect stillness.</w:t>
-      </w:r>
-    </w:p>
-    <w:p>
-      <w:r>
-        <w:t>Around the central floor, the elders of Chanakya had taken the front seats.</w:t>
+        <w:t>It was older than the tables around it, carved from dark stone and pale ceramic, its edges worn smooth by generations of hands that had reached for victory and found instruction instead. The pieces were arranged already. Black and white armies faced one another in perfect stillness.</w:t>
+      </w:r>
+    </w:p>
+    <w:p>
+      <w:r>
+        <w:t>In the enclosure, the elders of Chanakya had taken the ringed seats.</w:t>
       </w:r>
     </w:p>
     <w:p>
@@ -235,10 +215,7 @@
     </w:p>
     <w:p>
       <w:r>
-        <w:t>The Chanakya Grandmaster entered at an unhurried pace, and the room seemed to make space for him before he reached the board. Within the house he was the Arthashastri — master of the old science of wealth and statecraft that had given the gana its name — and the elders used the title the way other houses used a bow. Ravi stood at once. When the Grandmaster stopped across from him, Ravi bowed with one hand over his heart. The Grandmaster answered with a slight inclination of his head, equal parts acknowledgm</w:t>
-      </w:r>
-      <w:r>
-        <w:t>ent and assessment.</w:t>
+        <w:t>The Chanakya Grandmaster entered at an unhurried pace, and the room seemed to make space for him before he reached the board. Within the house he was the Arthashastri — master of the old science of wealth and statecraft that had given the gana its name — and the elders used the title the way other houses used a bow. Ravi stood at once. When the Grandmaster stopped across from him, Ravi bowed with one hand over his heart. The Grandmaster answered with a slight inclination of his head, equal parts acknowledgment and assessment.</w:t>
       </w:r>
     </w:p>
     <w:p>
@@ -248,10 +225,7 @@
     </w:p>
     <w:p>
       <w:r>
-        <w:t>He was smaller than Ravi had expected, and that somehow made the room arrange itself more carefully around him. His hair was silver-white and pulled back at the nape, his face narrow, his mouth almost gentle until he looked directly at a person. His eyes did not search. They arrived. He wore no crown, no visible mark of office beyond a simple green robe edged in black script, each line so fine that the fabric seemed to carry arguments rather than decoration. Age had thinned his body without softening it. If</w:t>
-      </w:r>
-      <w:r>
-        <w:t xml:space="preserve"> the body was old, the mind behind it looked young enough to be dangerous, younger than every student in the room because it had shed the need to prove itself.</w:t>
+        <w:t>He was smaller than Ravi had expected, and that somehow made the room arrange itself more carefully around him. His hair was silver-white and pulled back at the nape, his face narrow, his mouth almost gentle until he looked directly at a person. His eyes did not search. They arrived. He wore no crown, no visible mark of office beyond a simple green robe edged in black script, each line so fine that the fabric seemed to carry arguments rather than decoration. Age had thinned his body without softening it. If the body was old, the mind behind it looked young enough to be dangerous, younger than every student in the room because it had shed the need to prove itself.</w:t>
       </w:r>
     </w:p>
     <w:p>
@@ -281,24 +255,17 @@
     </w:p>
     <w:p>
       <w:r>
-        <w:rPr>
-          <w:highlight w:val="yellow"/>
-        </w:rPr>
-        <w:t>At the edge of the gymnasium, a second arena came alive.</w:t>
-      </w:r>
-    </w:p>
-    <w:p>
-      <w:r>
-        <w:lastRenderedPageBreak/>
-        <w:t>The living board occupied the adjacent floor, sixty-four pale and dark squares large enough for bodies, animals, and silence. Sixteen footmen in white stood opposite sixteen in black, each carrying a short ceremonial spear. Behind them waited the elephants, real and immense, ridden by handlers in lacquered harness. Horses stamped at the corners, flanked by tall camels draped in geometric cloth. At each back rank, an adorned horseman represented the king, upright and expressionless beneath a high crested hel</w:t>
-      </w:r>
-      <w:r>
-        <w:t>m. Beside him, a lady of honor sat astride a dark mare, veiled in green and gold, representing the queen with a stillness more commanding than ornament.</w:t>
-      </w:r>
-    </w:p>
-    <w:p>
-      <w:r>
-        <w:t>Chanakya staged the living board not to make chess beautiful but to make consequence visible. A small move at the table became a body crossing open ground. A careless exchange became a footman stepping into capture. A patient strategy became an animal waiting in disciplined heat while every spectator imagined the cost of moving it too soon.</w:t>
+        <w:t>Beyond the enclosure's rail, half a level down, the arena floor came alive.</w:t>
+      </w:r>
+    </w:p>
+    <w:p>
+      <w:r>
+        <w:t>The living board filled it: sixty-four pale and dark squares, each large enough to hold a mounted rider or a waiting elephant. Sixteen footmen in white stood opposite sixteen in black, each carrying a short ceremonial spear. Behind them waited the elephants, real and immense, ridden by handlers in lacquered harness. Horses stamped at the corners, flanked by tall camels draped in geometric cloth. At each back rank, an adorned horseman represented the king, upright and expressionless beneath a high crested helm. Beside him, a lady of honor sat astride a dark mare, robed in green and gold beneath a slender circlet, representing the queen with a stillness more commanding than ornament.</w:t>
+      </w:r>
+    </w:p>
+    <w:p>
+      <w:r>
+        <w:t>Chanakya staged the living board not to make chess beautiful but to make consequence visible. The thousands in the tiers could not read the small board in the enclosure; they read this one. A small move at the table became a body crossing open ground. A piece traded away carelessly became a man walking to the square where he would be taken, standing in it, and being led off the board while everyone watched. A patient strategy became an animal waiting in disciplined heat while every spectator imagined the cost of moving it too soon.</w:t>
       </w:r>
     </w:p>
     <w:p>
@@ -368,7 +335,6 @@
     </w:p>
     <w:p>
       <w:r>
-        <w:lastRenderedPageBreak/>
         <w:t>An announcer's voice rose from the gallery, amplified just enough to carry over hoof, breath, and dust.</w:t>
       </w:r>
     </w:p>
@@ -464,18 +430,17 @@
     </w:p>
     <w:p>
       <w:r>
-        <w:lastRenderedPageBreak/>
-        <w:t>The announcer's calls came faster: black pawn to queen four, white camel to king two, black horse takes center pawn, white queen to queen two. Each move crossed from the carved board into the arena — footmen vanishing into capture with bowed heads, camels cutting diagonals through unsettled dust. The ladies of honor remained still on their mounts, veils unmoving, waiting for the moment when a queen's silence would become the most dangerous thing in the room.</w:t>
-      </w:r>
-    </w:p>
-    <w:p>
-      <w:r>
-        <w:t>Ravi won material first.</w:t>
-      </w:r>
-    </w:p>
-    <w:p>
-      <w:r>
-        <w:t>His black horse took a white footman near the center. The living horse surged into the square, forelegs lifting, the rider's green pennant snapping once before the captured footman stepped back from the board. The elders murmured approval. Ravi had not only taken a piece; he had taken a tempo. The Grandmaster had to respond.</w:t>
+        <w:t>The announcer's calls came faster: black pawn to queen four, white camel to king two, black horse takes center pawn, white queen to queen two. Each move crossed from the carved board into the arena — footmen vanishing into capture with bowed heads, camels cutting diagonals through unsettled dust. The ladies of honor remained still on their mounts, robes unmoving, waiting for the moment when a queen's silence would become the most dangerous thing in the room.</w:t>
+      </w:r>
+    </w:p>
+    <w:p>
+      <w:r>
+        <w:t>Ravi struck first.</w:t>
+      </w:r>
+    </w:p>
+    <w:p>
+      <w:r>
+        <w:t>His black horse took a white footman near the center. The living horse surged into the square, forelegs lifting, the rider's green pennant snapping once before the captured footman stepped back from the board. The elders murmured approval. Ravi had not only taken a piece without losing one; he had seized the initiative. The Grandmaster had to respond.</w:t>
       </w:r>
     </w:p>
     <w:p>
@@ -490,7 +455,7 @@
     </w:p>
     <w:p>
       <w:r>
-        <w:t>With a quiet rook move that seemed, at first, almost administrative.</w:t>
+        <w:t>With a quiet move of his rook — the straight-line piece the living board rendered as an elephant — that seemed, at first, almost administrative.</w:t>
       </w:r>
     </w:p>
     <w:p>
@@ -550,11 +515,7 @@
     </w:p>
     <w:p>
       <w:r>
-        <w:t xml:space="preserve">The lady of honor in white guided her mare forward from stillness into motion. It was not a charge. It was a revelation. She crossed the board along a line Ravi had counted and </w:t>
-      </w:r>
-      <w:r>
-        <w:lastRenderedPageBreak/>
-        <w:t>dismissed four moves earlier, her veil lifting as the mare turned through the square. When she stopped, the arena seemed to tighten around her.</w:t>
+        <w:t>The lady of honor in white guided her mare forward from stillness into motion. It was not a charge. It was a revelation. She crossed the board along a line Ravi had counted and dismissed four moves earlier, her robe lifting as the mare turned through the square. When she stopped, the arena seemed to tighten around her.</w:t>
       </w:r>
     </w:p>
     <w:p>
@@ -644,7 +605,6 @@
     </w:p>
     <w:p>
       <w:r>
-        <w:lastRenderedPageBreak/>
         <w:t>In the arena, the black king's horseman shifted in the saddle, reins tightening. The living king had not moved, but even he seemed to understand that the walls were closing.</w:t>
       </w:r>
     </w:p>
@@ -695,7 +655,7 @@
     </w:p>
     <w:p>
       <w:r>
-        <w:t>No one in the gymnasium breathed.</w:t>
+        <w:t>No one in the arena breathed.</w:t>
       </w:r>
     </w:p>
     <w:p>
@@ -715,7 +675,7 @@
     </w:p>
     <w:p>
       <w:r>
-        <w:t>The words struck the gymnasium harder than any declaration of checkmate could have. The game was not resigned. Not drawn. Not won. Not lost.</w:t>
+        <w:t>The words struck the arena harder than any declaration of checkmate could have. The game was not resigned. Not drawn. Not won. Not lost.</w:t>
       </w:r>
     </w:p>
     <w:p>
@@ -735,7 +695,6 @@
     </w:p>
     <w:p>
       <w:r>
-        <w:lastRenderedPageBreak/>
         <w:t>"The board has not finished with you," the Grandmaster said. "Do not mistake an unfinished game for a spared one."</w:t>
       </w:r>
     </w:p>
@@ -766,7 +725,7 @@
     </w:p>
     <w:p>
       <w:r>
-        <w:t>Ravi left the gymnasium without waiting to be congratulated.</w:t>
+        <w:t>Ravi left the arena without waiting to be congratulated.</w:t>
       </w:r>
     </w:p>
     <w:p>
@@ -776,7 +735,7 @@
     </w:p>
     <w:p>
       <w:r>
-        <w:t>The corridor beyond the gymnasium curved into the Hall of Arguments.</w:t>
+        <w:t>The corridor beyond the arena curved into the Hall of Arguments.</w:t>
       </w:r>
     </w:p>
     <w:p>
@@ -796,33 +755,7 @@
     </w:p>
     <w:p>
       <w:r>
-        <w:t>In the narrower Corridor of Unsaid Things, black glass cases held blank paper, sealed envelopes, and unsigned drafts — the old lesson that most power lived in what was never written down. Two apprentices stood before a blank sheet while an instructor questioned them.</w:t>
-      </w:r>
-    </w:p>
-    <w:p>
-      <w:r>
-        <w:t>"What does it say?" the instructor asked.</w:t>
-      </w:r>
-    </w:p>
-    <w:p>
-      <w:r>
-        <w:t>"Nothing," one apprentice answered.</w:t>
-      </w:r>
-    </w:p>
-    <w:p>
-      <w:r>
-        <w:lastRenderedPageBreak/>
-        <w:t>The instructor waited.</w:t>
-      </w:r>
-    </w:p>
-    <w:p>
-      <w:r>
-        <w:t>The second apprentice corrected him. "It says someone chose not to speak here."</w:t>
-      </w:r>
-    </w:p>
-    <w:p>
-      <w:r>
-        <w:t>"Better," the instructor said.</w:t>
+        <w:t>In the narrower Corridor of Unsaid Things, black glass cases held blank paper, sealed envelopes, and unsigned drafts — the old lesson that most power lived in what was never written down. An instructor stood with two apprentices before one of the cases, teaching them to read a blank sheet not as nothing, but as a decision someone had made.</w:t>
       </w:r>
     </w:p>
     <w:p>
@@ -907,11 +840,7 @@
     </w:p>
     <w:p>
       <w:r>
-        <w:t xml:space="preserve">The Grandmaster could have sent it. That was the simplest explanation, and therefore the least trustworthy. If the Grandmaster had intended to spare him, why build the cage so </w:t>
-      </w:r>
-      <w:r>
-        <w:lastRenderedPageBreak/>
-        <w:t>completely? Why release the queen only after the private alert arrived? Why leave the table with the expression of a man calculating something larger than a student's education? Ravi was good, but he was not singular. There were older Chanakya players in the top ten, sharper players, more useful players. The Grandmaster had no reason to preserve Ravi from a complete defeat.</w:t>
+        <w:t>The Grandmaster could have sent it. That was the simplest explanation, and therefore the least trustworthy. If the Grandmaster had intended to spare him, why build the cage so completely? Why release the queen only after the private alert arrived? Why leave the table with the expression of a man calculating something larger than a student's education? Ravi was good, but he was not singular. There were older Chanakya players in the top ten, sharper players, more useful players. The Grandmaster had no reason to preserve Ravi from a complete defeat.</w:t>
       </w:r>
     </w:p>
     <w:p>
@@ -991,11 +920,7 @@
     </w:p>
     <w:p>
       <w:r>
-        <w:t xml:space="preserve">The obsidian ensemble held its shape around him, darker than the unlit room and almost as silent. He stood beside the wall for a moment, watching Ravi sleep with the black king still </w:t>
-      </w:r>
-      <w:r>
-        <w:lastRenderedPageBreak/>
-        <w:t>clenched in his hand. The young Chanakya representative had gone to sleep inside the mystery and failed, for once, to reason his way out of it.</w:t>
+        <w:t>The obsidian ensemble held its shape around him, darker than the unlit room and almost as silent. He stood beside the wall for a moment, watching Ravi sleep with the black king still clenched in his hand. The young Chanakya representative had gone to sleep inside the mystery and failed, for once, to reason his way out of it.</w:t>
       </w:r>
     </w:p>
     <w:p>
@@ -1035,7 +960,7 @@
     </w:p>
     <w:p>
       <w:r>
-        <w:t>Daren turned toward the narrow window above the writing surface. Beyond the glass, Trinity's artificial night held its ordered field of stars. For one breath, the dark place between them seemed to answer him again: the black hole, unseen until the light around it began to bend. He saw himself there, not as a man standing in another gana's room, but as the hidden mass already changing the paths of bodies that still believed they moved freely.</w:t>
+        <w:t>Daren turned toward the narrow window above the writing surface. Beyond the glass, the night sky held its field of stars over Chanakya's sleeping platform. For one breath, the dark place between them seemed to answer him again: the black hole, unseen until the light around it began to bend. He saw himself there, not as a man standing in another gana's room, but as the hidden mass already changing the paths of bodies that still believed they moved freely.</w:t>
       </w:r>
     </w:p>
     <w:p>
@@ -1045,10 +970,7 @@
     </w:p>
     <w:p>
       <w:r>
-        <w:t>The storage recess sealed behind him. The corridor outside Ravi's quarters carried the green-gray quiet of Chanakya's residential wing. Representatives passed in both directions, some returning from analysis rooms, others beginning the next rotation of morning work. Each time Daren approached, a wrist pane flickered, a wall sensor dimmed, or a route marker shifted by a fraction. No one stopped. No one challenged him. Eyes lowered to tablets, cuffs, floor grids, anything except the figure moving through thei</w:t>
-      </w:r>
-      <w:r>
-        <w:t>r midst.</w:t>
+        <w:t>The storage recess sealed behind him. The corridor outside Ravi's quarters carried the green-gray quiet of Chanakya's residential wing. Representatives passed in both directions, some returning from analysis rooms, others beginning the next rotation of morning work. Each time Daren approached, a wrist pane flickered, a wall sensor dimmed, or a route marker shifted by a fraction. No one stopped. No one challenged him. Eyes lowered to tablets, cuffs, floor grids, anything except the figure moving through their midst.</w:t>
       </w:r>
     </w:p>
     <w:p>
@@ -1068,11 +990,7 @@
     </w:p>
     <w:p>
       <w:r>
-        <w:t xml:space="preserve">The service maglev out of Trinity-2 was not empty. A Drona archivist dozed over a sealed case. Two Chanakya clerks traded annotations across a shared pane. An Ashoka responder stood at the mid-rail, posture regulation-perfect even at that hour. None of them looked at Daren, and yet the carriage arranged itself around him. The archivist shifted two seats </w:t>
-      </w:r>
-      <w:r>
-        <w:lastRenderedPageBreak/>
-        <w:t>farther down without fully waking. The clerks lowered their voices, then their pane. The responder — trained to catalog every body in a room — let his gaze pass across the dark figure at the end of the carriage and file it as cleared, though no clearance had been shown. Their wrist terminals had already spoken to the bracelet, and the bracelet had answered for him, and whatever it said outranked curiosity.</w:t>
+        <w:t>The service maglev out of Trinity-2 was not empty. A Drona archivist dozed over a sealed case. Two Chanakya clerks traded annotations across a shared pane. An Ashoka responder stood at the mid-rail, posture regulation-perfect even at that hour. None of them looked at Daren, and yet the carriage arranged itself around him. The archivist shifted two seats farther down without fully waking. The clerks lowered their voices, then their pane. The responder — trained to catalog every body in a room — let his gaze pass across the dark figure at the end of the carriage and file it as cleared, though no clearance had been shown. Their wrist terminals had already spoken to the bracelet, and the bracelet had answered for him, and whatever it said outranked curiosity.</w:t>
       </w:r>
     </w:p>
     <w:p>
@@ -1082,10 +1000,7 @@
     </w:p>
     <w:p>
       <w:r>
-        <w:t xml:space="preserve">He stood at the dark end of the last carriage and watched Chanakya's platform assemble itself beyond the glass: terraced conservatories where policy students argued beneath recording lamps, courts of green-and-ink glass stacked like folded documents, avenues where even the civilians walked as though every step might someday be quoted back to them. Chanakya's citizens were clerks, translators, archivists, teachers of rhetoric — people who lived one platform above the sector their words administered, and who </w:t>
-      </w:r>
-      <w:r>
-        <w:t>had learned to speak carefully without ever being told why.</w:t>
+        <w:t>He stood at the dark end of the last carriage and watched Chanakya's platform assemble itself beyond the glass: terraced conservatories where policy students argued beneath recording lamps, courts of green-and-ink glass stacked like folded documents, avenues where even the civilians walked as though every step might someday be quoted back to them. Chanakya's citizens were clerks, translators, archivists, teachers of rhetoric — people who lived one platform above the sector their words administered, and who had learned to speak carefully without ever being told why.</w:t>
       </w:r>
     </w:p>
     <w:p>
@@ -1095,10 +1010,17 @@
     </w:p>
     <w:p>
       <w:r>
-        <w:t>Meru received him the way it received everything: from below. The lift rose past the terrace districts where Kubera's wealthy kept their residences — gardens fed by water the sectors had lifted a kilometer against gravity, galleries of private collections no public archive would ever index, windows that looked down on the three Trinitys the way the Trinitys looked down on the mines. The people who lived on Meru did not call themselves rulers. They called themselves stewards, and the word had lasted a centur</w:t>
-      </w:r>
-      <w:r>
-        <w:t>y because no one below had ever been given the standing to laugh at it.</w:t>
+        <w:t>Meru received him the way it received everything: from below. The lift rose past the terrace districts where Kubera's wealthy kept their residences — gardens fed by water the sectors had lifted a kilometer against gravity, orchards ripening out of season under tuned light, galleries of private collections no public archive would ever index, windows that looked down on the three Trinitys the way the Trinitys looked down on the mines.</w:t>
+      </w:r>
+    </w:p>
+    <w:p>
+      <w:r>
+        <w:t>Even at this hour, the tier was awake in its own muted way. Lit terraces held late gatherings where conversation never rose above the sound of water; attendants moved along the garden paths with trays and lamps, people who rode the lifts up each morning from the three Trinitys and rode them down again at night, permitted to keep Meru beautiful but not to sleep in it. There were no markets here, no clinics, no school courtyards — nothing bought in public, nothing needed urgently, nothing learned by children who would not inherit it anyway. Meru's residents were trustees and account-holders, heirs of the founding houses, keepers of portfolios older than some of the ganas' own archives — families who had converted money into permanence so long ago that wealth no longer looked like anything at all. It looked like quiet.</w:t>
+      </w:r>
+    </w:p>
+    <w:p>
+      <w:r>
+        <w:t>The people who lived on Meru did not call themselves rulers. They called themselves stewards, and the word had lasted a century because no one below had ever been given the standing to laugh at it.</w:t>
       </w:r>
     </w:p>
     <w:p>

</xml_diff>